<commit_message>
Modified Load balancer file
</commit_message>
<xml_diff>
--- a/Load Balancer Tasks.docx
+++ b/Load Balancer Tasks.docx
@@ -62,6 +62,18 @@
           <w14:ligatures w14:val="none"/>
         </w:rPr>
         <w:t xml:space="preserve">Step 1: </w:t>
+      </w:r>
+      <w:r>
+        <w:rPr>
+          <w:rFonts w:eastAsia="Times New Roman" w:cstheme="minorHAnsi"/>
+          <w:color w:val="1D1C1D"/>
+          <w:kern w:val="0"/>
+          <w:sz w:val="28"/>
+          <w:szCs w:val="28"/>
+          <w:lang w:eastAsia="en-IN" w:bidi="ta-IN"/>
+          <w14:ligatures w14:val="none"/>
+        </w:rPr>
+        <w:t xml:space="preserve"> </w:t>
       </w:r>
     </w:p>
     <w:p>

</xml_diff>